<commit_message>
feat(cv): update professional summary
</commit_message>
<xml_diff>
--- a/public/CV_Carlos_Alzate_EN.docx
+++ b/public/CV_Carlos_Alzate_EN.docx
@@ -1093,7 +1093,7 @@
               <w:rPr>
                 <w:color w:val="222222"/>
               </w:rPr>
-              <w:t>Computer Engineer recently graduated from Universidad Autónoma de Occidente (Cali, Colombia), with a focus on web development and hands-on experience gained during my professional internship at CONSULNETWORKS S.A., where I contributed to the frontend development of an MVP corporate training platform. I work with React, Next.js, and TypeScript to build modern, functional, and responsive interfaces, applying a hybrid SSR + CSR architecture, authentication with JWT and MFA, state management with React Hooks and Context API, and PDF report generation.</w:t>
+              <w:t>Web Developer and Computer Engineer with hands-on experience building modern web applications using React, Next.js, TypeScript, and Tailwind CSS. I have contributed to building functional platforms with authentication, role-based dashboards, REST API consumption, PDF report generation, and deployment on environments such as Vercel and Supabase.</w:t>
             </w:r>
           </w:p>
           <w:p>
@@ -1104,7 +1104,7 @@
               <w:rPr>
                 <w:color w:val="222222"/>
               </w:rPr>
-              <w:t>I also have a foundation in backend development (Node.js, Nest.js, Python) and knowledge of DevOps and collaboration tools (Docker, Git, Azure DevOps, Jira) that allow me to understand the full software development lifecycle. Team-oriented professional with active listening, responsibility for task delivery, and a constant attitude of learning when facing technical challenges. I am looking for a first professional opportunity as a web developer where I can keep growing, deliver value from day one, and consolidate the foundations built during my degree and internship.</w:t>
+              <w:t>I have a foundation in backend, databases, and collaboration tools such as Node.js, PostgreSQL, Git, Docker, Jira, and Azure DevOps. I am known for responsibility, continuous learning, attention to detail, and the ability to work in a team. I am looking to keep growing as a web developer, delivering useful, scalable, and user-experience-oriented solutions.</w:t>
             </w:r>
           </w:p>
           <w:p>

</xml_diff>